<commit_message>
feat: Add Milestone 2 report, outline, and generated analysis figures including various model visualizations and data insights.
</commit_message>
<xml_diff>
--- a/Group Project/output.docx
+++ b/Group Project/output.docx
@@ -5380,7 +5380,6 @@
         <w:t>&lt;class '</w:t>
       </w:r>
       <w:proofErr w:type="spellStart"/>
-      <w:proofErr w:type="gramStart"/>
       <w:r>
         <w:rPr>
           <w:rFonts w:ascii="Courier New" w:eastAsia="Times New Roman" w:hAnsi="Courier New" w:cs="Courier New"/>
@@ -5389,32 +5388,9 @@
           <w:szCs w:val="20"/>
           <w14:ligatures w14:val="none"/>
         </w:rPr>
-        <w:t>pandas.core</w:t>
-      </w:r>
-      <w:proofErr w:type="gramEnd"/>
-      <w:r>
-        <w:rPr>
-          <w:rFonts w:ascii="Courier New" w:eastAsia="Times New Roman" w:hAnsi="Courier New" w:cs="Courier New"/>
-          <w:kern w:val="0"/>
-          <w:sz w:val="20"/>
-          <w:szCs w:val="20"/>
-          <w14:ligatures w14:val="none"/>
-        </w:rPr>
-        <w:t>.</w:t>
-      </w:r>
-      <w:proofErr w:type="gramStart"/>
-      <w:r>
-        <w:rPr>
-          <w:rFonts w:ascii="Courier New" w:eastAsia="Times New Roman" w:hAnsi="Courier New" w:cs="Courier New"/>
-          <w:kern w:val="0"/>
-          <w:sz w:val="20"/>
-          <w:szCs w:val="20"/>
-          <w14:ligatures w14:val="none"/>
-        </w:rPr>
-        <w:t>frame.DataFrame</w:t>
+        <w:t>pandas.core.frame.DataFrame</w:t>
       </w:r>
       <w:proofErr w:type="spellEnd"/>
-      <w:proofErr w:type="gramEnd"/>
       <w:r>
         <w:rPr>
           <w:rFonts w:ascii="Courier New" w:eastAsia="Times New Roman" w:hAnsi="Courier New" w:cs="Courier New"/>
@@ -6027,29 +6003,7 @@
           <w:szCs w:val="20"/>
           <w14:ligatures w14:val="none"/>
         </w:rPr>
-        <w:t>9   PAY_5      30000 non-</w:t>
-      </w:r>
-      <w:proofErr w:type="gramStart"/>
-      <w:r>
-        <w:rPr>
-          <w:rFonts w:ascii="Courier New" w:eastAsia="Times New Roman" w:hAnsi="Courier New" w:cs="Courier New"/>
-          <w:kern w:val="0"/>
-          <w:sz w:val="20"/>
-          <w:szCs w:val="20"/>
-          <w14:ligatures w14:val="none"/>
-        </w:rPr>
-        <w:t>null  int</w:t>
-      </w:r>
-      <w:proofErr w:type="gramEnd"/>
-      <w:r>
-        <w:rPr>
-          <w:rFonts w:ascii="Courier New" w:eastAsia="Times New Roman" w:hAnsi="Courier New" w:cs="Courier New"/>
-          <w:kern w:val="0"/>
-          <w:sz w:val="20"/>
-          <w:szCs w:val="20"/>
-          <w14:ligatures w14:val="none"/>
-        </w:rPr>
-        <w:t>64</w:t>
+        <w:t>9   PAY_5      30000 non-null  int64</w:t>
       </w:r>
     </w:p>
     <w:p>
@@ -6089,51 +6043,7 @@
           <w:szCs w:val="20"/>
           <w14:ligatures w14:val="none"/>
         </w:rPr>
-        <w:t xml:space="preserve"> </w:t>
-      </w:r>
-      <w:proofErr w:type="gramStart"/>
-      <w:r>
-        <w:rPr>
-          <w:rFonts w:ascii="Courier New" w:eastAsia="Times New Roman" w:hAnsi="Courier New" w:cs="Courier New"/>
-          <w:kern w:val="0"/>
-          <w:sz w:val="20"/>
-          <w:szCs w:val="20"/>
-          <w14:ligatures w14:val="none"/>
-        </w:rPr>
-        <w:t>10  PAY</w:t>
-      </w:r>
-      <w:proofErr w:type="gramEnd"/>
-      <w:r>
-        <w:rPr>
-          <w:rFonts w:ascii="Courier New" w:eastAsia="Times New Roman" w:hAnsi="Courier New" w:cs="Courier New"/>
-          <w:kern w:val="0"/>
-          <w:sz w:val="20"/>
-          <w:szCs w:val="20"/>
-          <w14:ligatures w14:val="none"/>
-        </w:rPr>
-        <w:t>_6      30000 non-</w:t>
-      </w:r>
-      <w:proofErr w:type="gramStart"/>
-      <w:r>
-        <w:rPr>
-          <w:rFonts w:ascii="Courier New" w:eastAsia="Times New Roman" w:hAnsi="Courier New" w:cs="Courier New"/>
-          <w:kern w:val="0"/>
-          <w:sz w:val="20"/>
-          <w:szCs w:val="20"/>
-          <w14:ligatures w14:val="none"/>
-        </w:rPr>
-        <w:t>null  int</w:t>
-      </w:r>
-      <w:proofErr w:type="gramEnd"/>
-      <w:r>
-        <w:rPr>
-          <w:rFonts w:ascii="Courier New" w:eastAsia="Times New Roman" w:hAnsi="Courier New" w:cs="Courier New"/>
-          <w:kern w:val="0"/>
-          <w:sz w:val="20"/>
-          <w:szCs w:val="20"/>
-          <w14:ligatures w14:val="none"/>
-        </w:rPr>
-        <w:t>64</w:t>
+        <w:t xml:space="preserve"> 10  PAY_6      30000 non-null  int64</w:t>
       </w:r>
     </w:p>
     <w:p>
@@ -6173,73 +6083,7 @@
           <w:szCs w:val="20"/>
           <w14:ligatures w14:val="none"/>
         </w:rPr>
-        <w:t xml:space="preserve"> </w:t>
-      </w:r>
-      <w:proofErr w:type="gramStart"/>
-      <w:r>
-        <w:rPr>
-          <w:rFonts w:ascii="Courier New" w:eastAsia="Times New Roman" w:hAnsi="Courier New" w:cs="Courier New"/>
-          <w:kern w:val="0"/>
-          <w:sz w:val="20"/>
-          <w:szCs w:val="20"/>
-          <w14:ligatures w14:val="none"/>
-        </w:rPr>
-        <w:t>11  BILL</w:t>
-      </w:r>
-      <w:proofErr w:type="gramEnd"/>
-      <w:r>
-        <w:rPr>
-          <w:rFonts w:ascii="Courier New" w:eastAsia="Times New Roman" w:hAnsi="Courier New" w:cs="Courier New"/>
-          <w:kern w:val="0"/>
-          <w:sz w:val="20"/>
-          <w:szCs w:val="20"/>
-          <w14:ligatures w14:val="none"/>
-        </w:rPr>
-        <w:t>_AMT</w:t>
-      </w:r>
-      <w:proofErr w:type="gramStart"/>
-      <w:r>
-        <w:rPr>
-          <w:rFonts w:ascii="Courier New" w:eastAsia="Times New Roman" w:hAnsi="Courier New" w:cs="Courier New"/>
-          <w:kern w:val="0"/>
-          <w:sz w:val="20"/>
-          <w:szCs w:val="20"/>
-          <w14:ligatures w14:val="none"/>
-        </w:rPr>
-        <w:t>1  30000</w:t>
-      </w:r>
-      <w:proofErr w:type="gramEnd"/>
-      <w:r>
-        <w:rPr>
-          <w:rFonts w:ascii="Courier New" w:eastAsia="Times New Roman" w:hAnsi="Courier New" w:cs="Courier New"/>
-          <w:kern w:val="0"/>
-          <w:sz w:val="20"/>
-          <w:szCs w:val="20"/>
-          <w14:ligatures w14:val="none"/>
-        </w:rPr>
-        <w:t xml:space="preserve"> non-</w:t>
-      </w:r>
-      <w:proofErr w:type="gramStart"/>
-      <w:r>
-        <w:rPr>
-          <w:rFonts w:ascii="Courier New" w:eastAsia="Times New Roman" w:hAnsi="Courier New" w:cs="Courier New"/>
-          <w:kern w:val="0"/>
-          <w:sz w:val="20"/>
-          <w:szCs w:val="20"/>
-          <w14:ligatures w14:val="none"/>
-        </w:rPr>
-        <w:t>null  int</w:t>
-      </w:r>
-      <w:proofErr w:type="gramEnd"/>
-      <w:r>
-        <w:rPr>
-          <w:rFonts w:ascii="Courier New" w:eastAsia="Times New Roman" w:hAnsi="Courier New" w:cs="Courier New"/>
-          <w:kern w:val="0"/>
-          <w:sz w:val="20"/>
-          <w:szCs w:val="20"/>
-          <w14:ligatures w14:val="none"/>
-        </w:rPr>
-        <w:t>64</w:t>
+        <w:t xml:space="preserve"> 11  BILL_AMT1  30000 non-null  int64</w:t>
       </w:r>
     </w:p>
     <w:p>
@@ -6279,73 +6123,7 @@
           <w:szCs w:val="20"/>
           <w14:ligatures w14:val="none"/>
         </w:rPr>
-        <w:t xml:space="preserve"> </w:t>
-      </w:r>
-      <w:proofErr w:type="gramStart"/>
-      <w:r>
-        <w:rPr>
-          <w:rFonts w:ascii="Courier New" w:eastAsia="Times New Roman" w:hAnsi="Courier New" w:cs="Courier New"/>
-          <w:kern w:val="0"/>
-          <w:sz w:val="20"/>
-          <w:szCs w:val="20"/>
-          <w14:ligatures w14:val="none"/>
-        </w:rPr>
-        <w:t>12  BILL</w:t>
-      </w:r>
-      <w:proofErr w:type="gramEnd"/>
-      <w:r>
-        <w:rPr>
-          <w:rFonts w:ascii="Courier New" w:eastAsia="Times New Roman" w:hAnsi="Courier New" w:cs="Courier New"/>
-          <w:kern w:val="0"/>
-          <w:sz w:val="20"/>
-          <w:szCs w:val="20"/>
-          <w14:ligatures w14:val="none"/>
-        </w:rPr>
-        <w:t>_AMT</w:t>
-      </w:r>
-      <w:proofErr w:type="gramStart"/>
-      <w:r>
-        <w:rPr>
-          <w:rFonts w:ascii="Courier New" w:eastAsia="Times New Roman" w:hAnsi="Courier New" w:cs="Courier New"/>
-          <w:kern w:val="0"/>
-          <w:sz w:val="20"/>
-          <w:szCs w:val="20"/>
-          <w14:ligatures w14:val="none"/>
-        </w:rPr>
-        <w:t>2  30000</w:t>
-      </w:r>
-      <w:proofErr w:type="gramEnd"/>
-      <w:r>
-        <w:rPr>
-          <w:rFonts w:ascii="Courier New" w:eastAsia="Times New Roman" w:hAnsi="Courier New" w:cs="Courier New"/>
-          <w:kern w:val="0"/>
-          <w:sz w:val="20"/>
-          <w:szCs w:val="20"/>
-          <w14:ligatures w14:val="none"/>
-        </w:rPr>
-        <w:t xml:space="preserve"> non-</w:t>
-      </w:r>
-      <w:proofErr w:type="gramStart"/>
-      <w:r>
-        <w:rPr>
-          <w:rFonts w:ascii="Courier New" w:eastAsia="Times New Roman" w:hAnsi="Courier New" w:cs="Courier New"/>
-          <w:kern w:val="0"/>
-          <w:sz w:val="20"/>
-          <w:szCs w:val="20"/>
-          <w14:ligatures w14:val="none"/>
-        </w:rPr>
-        <w:t>null  int</w:t>
-      </w:r>
-      <w:proofErr w:type="gramEnd"/>
-      <w:r>
-        <w:rPr>
-          <w:rFonts w:ascii="Courier New" w:eastAsia="Times New Roman" w:hAnsi="Courier New" w:cs="Courier New"/>
-          <w:kern w:val="0"/>
-          <w:sz w:val="20"/>
-          <w:szCs w:val="20"/>
-          <w14:ligatures w14:val="none"/>
-        </w:rPr>
-        <w:t>64</w:t>
+        <w:t xml:space="preserve"> 12  BILL_AMT2  30000 non-null  int64</w:t>
       </w:r>
     </w:p>
     <w:p>
@@ -6385,73 +6163,7 @@
           <w:szCs w:val="20"/>
           <w14:ligatures w14:val="none"/>
         </w:rPr>
-        <w:t xml:space="preserve"> </w:t>
-      </w:r>
-      <w:proofErr w:type="gramStart"/>
-      <w:r>
-        <w:rPr>
-          <w:rFonts w:ascii="Courier New" w:eastAsia="Times New Roman" w:hAnsi="Courier New" w:cs="Courier New"/>
-          <w:kern w:val="0"/>
-          <w:sz w:val="20"/>
-          <w:szCs w:val="20"/>
-          <w14:ligatures w14:val="none"/>
-        </w:rPr>
-        <w:t>13  BILL</w:t>
-      </w:r>
-      <w:proofErr w:type="gramEnd"/>
-      <w:r>
-        <w:rPr>
-          <w:rFonts w:ascii="Courier New" w:eastAsia="Times New Roman" w:hAnsi="Courier New" w:cs="Courier New"/>
-          <w:kern w:val="0"/>
-          <w:sz w:val="20"/>
-          <w:szCs w:val="20"/>
-          <w14:ligatures w14:val="none"/>
-        </w:rPr>
-        <w:t>_AMT</w:t>
-      </w:r>
-      <w:proofErr w:type="gramStart"/>
-      <w:r>
-        <w:rPr>
-          <w:rFonts w:ascii="Courier New" w:eastAsia="Times New Roman" w:hAnsi="Courier New" w:cs="Courier New"/>
-          <w:kern w:val="0"/>
-          <w:sz w:val="20"/>
-          <w:szCs w:val="20"/>
-          <w14:ligatures w14:val="none"/>
-        </w:rPr>
-        <w:t>3  30000</w:t>
-      </w:r>
-      <w:proofErr w:type="gramEnd"/>
-      <w:r>
-        <w:rPr>
-          <w:rFonts w:ascii="Courier New" w:eastAsia="Times New Roman" w:hAnsi="Courier New" w:cs="Courier New"/>
-          <w:kern w:val="0"/>
-          <w:sz w:val="20"/>
-          <w:szCs w:val="20"/>
-          <w14:ligatures w14:val="none"/>
-        </w:rPr>
-        <w:t xml:space="preserve"> non-</w:t>
-      </w:r>
-      <w:proofErr w:type="gramStart"/>
-      <w:r>
-        <w:rPr>
-          <w:rFonts w:ascii="Courier New" w:eastAsia="Times New Roman" w:hAnsi="Courier New" w:cs="Courier New"/>
-          <w:kern w:val="0"/>
-          <w:sz w:val="20"/>
-          <w:szCs w:val="20"/>
-          <w14:ligatures w14:val="none"/>
-        </w:rPr>
-        <w:t>null  int</w:t>
-      </w:r>
-      <w:proofErr w:type="gramEnd"/>
-      <w:r>
-        <w:rPr>
-          <w:rFonts w:ascii="Courier New" w:eastAsia="Times New Roman" w:hAnsi="Courier New" w:cs="Courier New"/>
-          <w:kern w:val="0"/>
-          <w:sz w:val="20"/>
-          <w:szCs w:val="20"/>
-          <w14:ligatures w14:val="none"/>
-        </w:rPr>
-        <w:t>64</w:t>
+        <w:t xml:space="preserve"> 13  BILL_AMT3  30000 non-null  int64</w:t>
       </w:r>
     </w:p>
     <w:p>
@@ -6491,73 +6203,7 @@
           <w:szCs w:val="20"/>
           <w14:ligatures w14:val="none"/>
         </w:rPr>
-        <w:t xml:space="preserve"> </w:t>
-      </w:r>
-      <w:proofErr w:type="gramStart"/>
-      <w:r>
-        <w:rPr>
-          <w:rFonts w:ascii="Courier New" w:eastAsia="Times New Roman" w:hAnsi="Courier New" w:cs="Courier New"/>
-          <w:kern w:val="0"/>
-          <w:sz w:val="20"/>
-          <w:szCs w:val="20"/>
-          <w14:ligatures w14:val="none"/>
-        </w:rPr>
-        <w:t>14  BILL</w:t>
-      </w:r>
-      <w:proofErr w:type="gramEnd"/>
-      <w:r>
-        <w:rPr>
-          <w:rFonts w:ascii="Courier New" w:eastAsia="Times New Roman" w:hAnsi="Courier New" w:cs="Courier New"/>
-          <w:kern w:val="0"/>
-          <w:sz w:val="20"/>
-          <w:szCs w:val="20"/>
-          <w14:ligatures w14:val="none"/>
-        </w:rPr>
-        <w:t>_AMT</w:t>
-      </w:r>
-      <w:proofErr w:type="gramStart"/>
-      <w:r>
-        <w:rPr>
-          <w:rFonts w:ascii="Courier New" w:eastAsia="Times New Roman" w:hAnsi="Courier New" w:cs="Courier New"/>
-          <w:kern w:val="0"/>
-          <w:sz w:val="20"/>
-          <w:szCs w:val="20"/>
-          <w14:ligatures w14:val="none"/>
-        </w:rPr>
-        <w:t>4  30000</w:t>
-      </w:r>
-      <w:proofErr w:type="gramEnd"/>
-      <w:r>
-        <w:rPr>
-          <w:rFonts w:ascii="Courier New" w:eastAsia="Times New Roman" w:hAnsi="Courier New" w:cs="Courier New"/>
-          <w:kern w:val="0"/>
-          <w:sz w:val="20"/>
-          <w:szCs w:val="20"/>
-          <w14:ligatures w14:val="none"/>
-        </w:rPr>
-        <w:t xml:space="preserve"> non-</w:t>
-      </w:r>
-      <w:proofErr w:type="gramStart"/>
-      <w:r>
-        <w:rPr>
-          <w:rFonts w:ascii="Courier New" w:eastAsia="Times New Roman" w:hAnsi="Courier New" w:cs="Courier New"/>
-          <w:kern w:val="0"/>
-          <w:sz w:val="20"/>
-          <w:szCs w:val="20"/>
-          <w14:ligatures w14:val="none"/>
-        </w:rPr>
-        <w:t>null  int</w:t>
-      </w:r>
-      <w:proofErr w:type="gramEnd"/>
-      <w:r>
-        <w:rPr>
-          <w:rFonts w:ascii="Courier New" w:eastAsia="Times New Roman" w:hAnsi="Courier New" w:cs="Courier New"/>
-          <w:kern w:val="0"/>
-          <w:sz w:val="20"/>
-          <w:szCs w:val="20"/>
-          <w14:ligatures w14:val="none"/>
-        </w:rPr>
-        <w:t>64</w:t>
+        <w:t xml:space="preserve"> 14  BILL_AMT4  30000 non-null  int64</w:t>
       </w:r>
     </w:p>
     <w:p>
@@ -6597,73 +6243,7 @@
           <w:szCs w:val="20"/>
           <w14:ligatures w14:val="none"/>
         </w:rPr>
-        <w:t xml:space="preserve"> </w:t>
-      </w:r>
-      <w:proofErr w:type="gramStart"/>
-      <w:r>
-        <w:rPr>
-          <w:rFonts w:ascii="Courier New" w:eastAsia="Times New Roman" w:hAnsi="Courier New" w:cs="Courier New"/>
-          <w:kern w:val="0"/>
-          <w:sz w:val="20"/>
-          <w:szCs w:val="20"/>
-          <w14:ligatures w14:val="none"/>
-        </w:rPr>
-        <w:t>15  BILL</w:t>
-      </w:r>
-      <w:proofErr w:type="gramEnd"/>
-      <w:r>
-        <w:rPr>
-          <w:rFonts w:ascii="Courier New" w:eastAsia="Times New Roman" w:hAnsi="Courier New" w:cs="Courier New"/>
-          <w:kern w:val="0"/>
-          <w:sz w:val="20"/>
-          <w:szCs w:val="20"/>
-          <w14:ligatures w14:val="none"/>
-        </w:rPr>
-        <w:t>_AMT</w:t>
-      </w:r>
-      <w:proofErr w:type="gramStart"/>
-      <w:r>
-        <w:rPr>
-          <w:rFonts w:ascii="Courier New" w:eastAsia="Times New Roman" w:hAnsi="Courier New" w:cs="Courier New"/>
-          <w:kern w:val="0"/>
-          <w:sz w:val="20"/>
-          <w:szCs w:val="20"/>
-          <w14:ligatures w14:val="none"/>
-        </w:rPr>
-        <w:t>5  30000</w:t>
-      </w:r>
-      <w:proofErr w:type="gramEnd"/>
-      <w:r>
-        <w:rPr>
-          <w:rFonts w:ascii="Courier New" w:eastAsia="Times New Roman" w:hAnsi="Courier New" w:cs="Courier New"/>
-          <w:kern w:val="0"/>
-          <w:sz w:val="20"/>
-          <w:szCs w:val="20"/>
-          <w14:ligatures w14:val="none"/>
-        </w:rPr>
-        <w:t xml:space="preserve"> non-</w:t>
-      </w:r>
-      <w:proofErr w:type="gramStart"/>
-      <w:r>
-        <w:rPr>
-          <w:rFonts w:ascii="Courier New" w:eastAsia="Times New Roman" w:hAnsi="Courier New" w:cs="Courier New"/>
-          <w:kern w:val="0"/>
-          <w:sz w:val="20"/>
-          <w:szCs w:val="20"/>
-          <w14:ligatures w14:val="none"/>
-        </w:rPr>
-        <w:t>null  int</w:t>
-      </w:r>
-      <w:proofErr w:type="gramEnd"/>
-      <w:r>
-        <w:rPr>
-          <w:rFonts w:ascii="Courier New" w:eastAsia="Times New Roman" w:hAnsi="Courier New" w:cs="Courier New"/>
-          <w:kern w:val="0"/>
-          <w:sz w:val="20"/>
-          <w:szCs w:val="20"/>
-          <w14:ligatures w14:val="none"/>
-        </w:rPr>
-        <w:t>64</w:t>
+        <w:t xml:space="preserve"> 15  BILL_AMT5  30000 non-null  int64</w:t>
       </w:r>
     </w:p>
     <w:p>
@@ -6703,73 +6283,7 @@
           <w:szCs w:val="20"/>
           <w14:ligatures w14:val="none"/>
         </w:rPr>
-        <w:t xml:space="preserve"> </w:t>
-      </w:r>
-      <w:proofErr w:type="gramStart"/>
-      <w:r>
-        <w:rPr>
-          <w:rFonts w:ascii="Courier New" w:eastAsia="Times New Roman" w:hAnsi="Courier New" w:cs="Courier New"/>
-          <w:kern w:val="0"/>
-          <w:sz w:val="20"/>
-          <w:szCs w:val="20"/>
-          <w14:ligatures w14:val="none"/>
-        </w:rPr>
-        <w:t>16  BILL</w:t>
-      </w:r>
-      <w:proofErr w:type="gramEnd"/>
-      <w:r>
-        <w:rPr>
-          <w:rFonts w:ascii="Courier New" w:eastAsia="Times New Roman" w:hAnsi="Courier New" w:cs="Courier New"/>
-          <w:kern w:val="0"/>
-          <w:sz w:val="20"/>
-          <w:szCs w:val="20"/>
-          <w14:ligatures w14:val="none"/>
-        </w:rPr>
-        <w:t>_AMT</w:t>
-      </w:r>
-      <w:proofErr w:type="gramStart"/>
-      <w:r>
-        <w:rPr>
-          <w:rFonts w:ascii="Courier New" w:eastAsia="Times New Roman" w:hAnsi="Courier New" w:cs="Courier New"/>
-          <w:kern w:val="0"/>
-          <w:sz w:val="20"/>
-          <w:szCs w:val="20"/>
-          <w14:ligatures w14:val="none"/>
-        </w:rPr>
-        <w:t>6  30000</w:t>
-      </w:r>
-      <w:proofErr w:type="gramEnd"/>
-      <w:r>
-        <w:rPr>
-          <w:rFonts w:ascii="Courier New" w:eastAsia="Times New Roman" w:hAnsi="Courier New" w:cs="Courier New"/>
-          <w:kern w:val="0"/>
-          <w:sz w:val="20"/>
-          <w:szCs w:val="20"/>
-          <w14:ligatures w14:val="none"/>
-        </w:rPr>
-        <w:t xml:space="preserve"> non-</w:t>
-      </w:r>
-      <w:proofErr w:type="gramStart"/>
-      <w:r>
-        <w:rPr>
-          <w:rFonts w:ascii="Courier New" w:eastAsia="Times New Roman" w:hAnsi="Courier New" w:cs="Courier New"/>
-          <w:kern w:val="0"/>
-          <w:sz w:val="20"/>
-          <w:szCs w:val="20"/>
-          <w14:ligatures w14:val="none"/>
-        </w:rPr>
-        <w:t>null  int</w:t>
-      </w:r>
-      <w:proofErr w:type="gramEnd"/>
-      <w:r>
-        <w:rPr>
-          <w:rFonts w:ascii="Courier New" w:eastAsia="Times New Roman" w:hAnsi="Courier New" w:cs="Courier New"/>
-          <w:kern w:val="0"/>
-          <w:sz w:val="20"/>
-          <w:szCs w:val="20"/>
-          <w14:ligatures w14:val="none"/>
-        </w:rPr>
-        <w:t>64</w:t>
+        <w:t xml:space="preserve"> 16  BILL_AMT6  30000 non-null  int64</w:t>
       </w:r>
     </w:p>
     <w:p>
@@ -6809,51 +6323,7 @@
           <w:szCs w:val="20"/>
           <w14:ligatures w14:val="none"/>
         </w:rPr>
-        <w:t xml:space="preserve"> </w:t>
-      </w:r>
-      <w:proofErr w:type="gramStart"/>
-      <w:r>
-        <w:rPr>
-          <w:rFonts w:ascii="Courier New" w:eastAsia="Times New Roman" w:hAnsi="Courier New" w:cs="Courier New"/>
-          <w:kern w:val="0"/>
-          <w:sz w:val="20"/>
-          <w:szCs w:val="20"/>
-          <w14:ligatures w14:val="none"/>
-        </w:rPr>
-        <w:t>17  PAY</w:t>
-      </w:r>
-      <w:proofErr w:type="gramEnd"/>
-      <w:r>
-        <w:rPr>
-          <w:rFonts w:ascii="Courier New" w:eastAsia="Times New Roman" w:hAnsi="Courier New" w:cs="Courier New"/>
-          <w:kern w:val="0"/>
-          <w:sz w:val="20"/>
-          <w:szCs w:val="20"/>
-          <w14:ligatures w14:val="none"/>
-        </w:rPr>
-        <w:t>_AMT1   30000 non-</w:t>
-      </w:r>
-      <w:proofErr w:type="gramStart"/>
-      <w:r>
-        <w:rPr>
-          <w:rFonts w:ascii="Courier New" w:eastAsia="Times New Roman" w:hAnsi="Courier New" w:cs="Courier New"/>
-          <w:kern w:val="0"/>
-          <w:sz w:val="20"/>
-          <w:szCs w:val="20"/>
-          <w14:ligatures w14:val="none"/>
-        </w:rPr>
-        <w:t>null  int</w:t>
-      </w:r>
-      <w:proofErr w:type="gramEnd"/>
-      <w:r>
-        <w:rPr>
-          <w:rFonts w:ascii="Courier New" w:eastAsia="Times New Roman" w:hAnsi="Courier New" w:cs="Courier New"/>
-          <w:kern w:val="0"/>
-          <w:sz w:val="20"/>
-          <w:szCs w:val="20"/>
-          <w14:ligatures w14:val="none"/>
-        </w:rPr>
-        <w:t>64</w:t>
+        <w:t xml:space="preserve"> 17  PAY_AMT1   30000 non-null  int64</w:t>
       </w:r>
     </w:p>
     <w:p>
@@ -6893,51 +6363,7 @@
           <w:szCs w:val="20"/>
           <w14:ligatures w14:val="none"/>
         </w:rPr>
-        <w:t xml:space="preserve"> </w:t>
-      </w:r>
-      <w:proofErr w:type="gramStart"/>
-      <w:r>
-        <w:rPr>
-          <w:rFonts w:ascii="Courier New" w:eastAsia="Times New Roman" w:hAnsi="Courier New" w:cs="Courier New"/>
-          <w:kern w:val="0"/>
-          <w:sz w:val="20"/>
-          <w:szCs w:val="20"/>
-          <w14:ligatures w14:val="none"/>
-        </w:rPr>
-        <w:t>18  PAY</w:t>
-      </w:r>
-      <w:proofErr w:type="gramEnd"/>
-      <w:r>
-        <w:rPr>
-          <w:rFonts w:ascii="Courier New" w:eastAsia="Times New Roman" w:hAnsi="Courier New" w:cs="Courier New"/>
-          <w:kern w:val="0"/>
-          <w:sz w:val="20"/>
-          <w:szCs w:val="20"/>
-          <w14:ligatures w14:val="none"/>
-        </w:rPr>
-        <w:t>_AMT2   30000 non-</w:t>
-      </w:r>
-      <w:proofErr w:type="gramStart"/>
-      <w:r>
-        <w:rPr>
-          <w:rFonts w:ascii="Courier New" w:eastAsia="Times New Roman" w:hAnsi="Courier New" w:cs="Courier New"/>
-          <w:kern w:val="0"/>
-          <w:sz w:val="20"/>
-          <w:szCs w:val="20"/>
-          <w14:ligatures w14:val="none"/>
-        </w:rPr>
-        <w:t>null  int</w:t>
-      </w:r>
-      <w:proofErr w:type="gramEnd"/>
-      <w:r>
-        <w:rPr>
-          <w:rFonts w:ascii="Courier New" w:eastAsia="Times New Roman" w:hAnsi="Courier New" w:cs="Courier New"/>
-          <w:kern w:val="0"/>
-          <w:sz w:val="20"/>
-          <w:szCs w:val="20"/>
-          <w14:ligatures w14:val="none"/>
-        </w:rPr>
-        <w:t>64</w:t>
+        <w:t xml:space="preserve"> 18  PAY_AMT2   30000 non-null  int64</w:t>
       </w:r>
     </w:p>
     <w:p>
@@ -6977,51 +6403,7 @@
           <w:szCs w:val="20"/>
           <w14:ligatures w14:val="none"/>
         </w:rPr>
-        <w:t xml:space="preserve"> </w:t>
-      </w:r>
-      <w:proofErr w:type="gramStart"/>
-      <w:r>
-        <w:rPr>
-          <w:rFonts w:ascii="Courier New" w:eastAsia="Times New Roman" w:hAnsi="Courier New" w:cs="Courier New"/>
-          <w:kern w:val="0"/>
-          <w:sz w:val="20"/>
-          <w:szCs w:val="20"/>
-          <w14:ligatures w14:val="none"/>
-        </w:rPr>
-        <w:t>19  PAY</w:t>
-      </w:r>
-      <w:proofErr w:type="gramEnd"/>
-      <w:r>
-        <w:rPr>
-          <w:rFonts w:ascii="Courier New" w:eastAsia="Times New Roman" w:hAnsi="Courier New" w:cs="Courier New"/>
-          <w:kern w:val="0"/>
-          <w:sz w:val="20"/>
-          <w:szCs w:val="20"/>
-          <w14:ligatures w14:val="none"/>
-        </w:rPr>
-        <w:t>_AMT3   30000 non-</w:t>
-      </w:r>
-      <w:proofErr w:type="gramStart"/>
-      <w:r>
-        <w:rPr>
-          <w:rFonts w:ascii="Courier New" w:eastAsia="Times New Roman" w:hAnsi="Courier New" w:cs="Courier New"/>
-          <w:kern w:val="0"/>
-          <w:sz w:val="20"/>
-          <w:szCs w:val="20"/>
-          <w14:ligatures w14:val="none"/>
-        </w:rPr>
-        <w:t>null  int</w:t>
-      </w:r>
-      <w:proofErr w:type="gramEnd"/>
-      <w:r>
-        <w:rPr>
-          <w:rFonts w:ascii="Courier New" w:eastAsia="Times New Roman" w:hAnsi="Courier New" w:cs="Courier New"/>
-          <w:kern w:val="0"/>
-          <w:sz w:val="20"/>
-          <w:szCs w:val="20"/>
-          <w14:ligatures w14:val="none"/>
-        </w:rPr>
-        <w:t>64</w:t>
+        <w:t xml:space="preserve"> 19  PAY_AMT3   30000 non-null  int64</w:t>
       </w:r>
     </w:p>
     <w:p>
@@ -7061,51 +6443,7 @@
           <w:szCs w:val="20"/>
           <w14:ligatures w14:val="none"/>
         </w:rPr>
-        <w:t xml:space="preserve"> </w:t>
-      </w:r>
-      <w:proofErr w:type="gramStart"/>
-      <w:r>
-        <w:rPr>
-          <w:rFonts w:ascii="Courier New" w:eastAsia="Times New Roman" w:hAnsi="Courier New" w:cs="Courier New"/>
-          <w:kern w:val="0"/>
-          <w:sz w:val="20"/>
-          <w:szCs w:val="20"/>
-          <w14:ligatures w14:val="none"/>
-        </w:rPr>
-        <w:t>20  PAY</w:t>
-      </w:r>
-      <w:proofErr w:type="gramEnd"/>
-      <w:r>
-        <w:rPr>
-          <w:rFonts w:ascii="Courier New" w:eastAsia="Times New Roman" w:hAnsi="Courier New" w:cs="Courier New"/>
-          <w:kern w:val="0"/>
-          <w:sz w:val="20"/>
-          <w:szCs w:val="20"/>
-          <w14:ligatures w14:val="none"/>
-        </w:rPr>
-        <w:t>_AMT4   30000 non-</w:t>
-      </w:r>
-      <w:proofErr w:type="gramStart"/>
-      <w:r>
-        <w:rPr>
-          <w:rFonts w:ascii="Courier New" w:eastAsia="Times New Roman" w:hAnsi="Courier New" w:cs="Courier New"/>
-          <w:kern w:val="0"/>
-          <w:sz w:val="20"/>
-          <w:szCs w:val="20"/>
-          <w14:ligatures w14:val="none"/>
-        </w:rPr>
-        <w:t>null  int</w:t>
-      </w:r>
-      <w:proofErr w:type="gramEnd"/>
-      <w:r>
-        <w:rPr>
-          <w:rFonts w:ascii="Courier New" w:eastAsia="Times New Roman" w:hAnsi="Courier New" w:cs="Courier New"/>
-          <w:kern w:val="0"/>
-          <w:sz w:val="20"/>
-          <w:szCs w:val="20"/>
-          <w14:ligatures w14:val="none"/>
-        </w:rPr>
-        <w:t>64</w:t>
+        <w:t xml:space="preserve"> 20  PAY_AMT4   30000 non-null  int64</w:t>
       </w:r>
     </w:p>
     <w:p>
@@ -7145,51 +6483,7 @@
           <w:szCs w:val="20"/>
           <w14:ligatures w14:val="none"/>
         </w:rPr>
-        <w:t xml:space="preserve"> </w:t>
-      </w:r>
-      <w:proofErr w:type="gramStart"/>
-      <w:r>
-        <w:rPr>
-          <w:rFonts w:ascii="Courier New" w:eastAsia="Times New Roman" w:hAnsi="Courier New" w:cs="Courier New"/>
-          <w:kern w:val="0"/>
-          <w:sz w:val="20"/>
-          <w:szCs w:val="20"/>
-          <w14:ligatures w14:val="none"/>
-        </w:rPr>
-        <w:t>21  PAY</w:t>
-      </w:r>
-      <w:proofErr w:type="gramEnd"/>
-      <w:r>
-        <w:rPr>
-          <w:rFonts w:ascii="Courier New" w:eastAsia="Times New Roman" w:hAnsi="Courier New" w:cs="Courier New"/>
-          <w:kern w:val="0"/>
-          <w:sz w:val="20"/>
-          <w:szCs w:val="20"/>
-          <w14:ligatures w14:val="none"/>
-        </w:rPr>
-        <w:t>_AMT5   30000 non-</w:t>
-      </w:r>
-      <w:proofErr w:type="gramStart"/>
-      <w:r>
-        <w:rPr>
-          <w:rFonts w:ascii="Courier New" w:eastAsia="Times New Roman" w:hAnsi="Courier New" w:cs="Courier New"/>
-          <w:kern w:val="0"/>
-          <w:sz w:val="20"/>
-          <w:szCs w:val="20"/>
-          <w14:ligatures w14:val="none"/>
-        </w:rPr>
-        <w:t>null  int</w:t>
-      </w:r>
-      <w:proofErr w:type="gramEnd"/>
-      <w:r>
-        <w:rPr>
-          <w:rFonts w:ascii="Courier New" w:eastAsia="Times New Roman" w:hAnsi="Courier New" w:cs="Courier New"/>
-          <w:kern w:val="0"/>
-          <w:sz w:val="20"/>
-          <w:szCs w:val="20"/>
-          <w14:ligatures w14:val="none"/>
-        </w:rPr>
-        <w:t>64</w:t>
+        <w:t xml:space="preserve"> 21  PAY_AMT5   30000 non-null  int64</w:t>
       </w:r>
     </w:p>
     <w:p>
@@ -7229,51 +6523,7 @@
           <w:szCs w:val="20"/>
           <w14:ligatures w14:val="none"/>
         </w:rPr>
-        <w:t xml:space="preserve"> </w:t>
-      </w:r>
-      <w:proofErr w:type="gramStart"/>
-      <w:r>
-        <w:rPr>
-          <w:rFonts w:ascii="Courier New" w:eastAsia="Times New Roman" w:hAnsi="Courier New" w:cs="Courier New"/>
-          <w:kern w:val="0"/>
-          <w:sz w:val="20"/>
-          <w:szCs w:val="20"/>
-          <w14:ligatures w14:val="none"/>
-        </w:rPr>
-        <w:t>22  PAY</w:t>
-      </w:r>
-      <w:proofErr w:type="gramEnd"/>
-      <w:r>
-        <w:rPr>
-          <w:rFonts w:ascii="Courier New" w:eastAsia="Times New Roman" w:hAnsi="Courier New" w:cs="Courier New"/>
-          <w:kern w:val="0"/>
-          <w:sz w:val="20"/>
-          <w:szCs w:val="20"/>
-          <w14:ligatures w14:val="none"/>
-        </w:rPr>
-        <w:t>_AMT6   30000 non-</w:t>
-      </w:r>
-      <w:proofErr w:type="gramStart"/>
-      <w:r>
-        <w:rPr>
-          <w:rFonts w:ascii="Courier New" w:eastAsia="Times New Roman" w:hAnsi="Courier New" w:cs="Courier New"/>
-          <w:kern w:val="0"/>
-          <w:sz w:val="20"/>
-          <w:szCs w:val="20"/>
-          <w14:ligatures w14:val="none"/>
-        </w:rPr>
-        <w:t>null  int</w:t>
-      </w:r>
-      <w:proofErr w:type="gramEnd"/>
-      <w:r>
-        <w:rPr>
-          <w:rFonts w:ascii="Courier New" w:eastAsia="Times New Roman" w:hAnsi="Courier New" w:cs="Courier New"/>
-          <w:kern w:val="0"/>
-          <w:sz w:val="20"/>
-          <w:szCs w:val="20"/>
-          <w14:ligatures w14:val="none"/>
-        </w:rPr>
-        <w:t>64</w:t>
+        <w:t xml:space="preserve"> 22  PAY_AMT6   30000 non-null  int64</w:t>
       </w:r>
     </w:p>
     <w:p>
@@ -7313,51 +6563,7 @@
           <w:szCs w:val="20"/>
           <w14:ligatures w14:val="none"/>
         </w:rPr>
-        <w:t xml:space="preserve"> </w:t>
-      </w:r>
-      <w:proofErr w:type="gramStart"/>
-      <w:r>
-        <w:rPr>
-          <w:rFonts w:ascii="Courier New" w:eastAsia="Times New Roman" w:hAnsi="Courier New" w:cs="Courier New"/>
-          <w:kern w:val="0"/>
-          <w:sz w:val="20"/>
-          <w:szCs w:val="20"/>
-          <w14:ligatures w14:val="none"/>
-        </w:rPr>
-        <w:t>23  default</w:t>
-      </w:r>
-      <w:proofErr w:type="gramEnd"/>
-      <w:r>
-        <w:rPr>
-          <w:rFonts w:ascii="Courier New" w:eastAsia="Times New Roman" w:hAnsi="Courier New" w:cs="Courier New"/>
-          <w:kern w:val="0"/>
-          <w:sz w:val="20"/>
-          <w:szCs w:val="20"/>
-          <w14:ligatures w14:val="none"/>
-        </w:rPr>
-        <w:t xml:space="preserve">    30000 non-</w:t>
-      </w:r>
-      <w:proofErr w:type="gramStart"/>
-      <w:r>
-        <w:rPr>
-          <w:rFonts w:ascii="Courier New" w:eastAsia="Times New Roman" w:hAnsi="Courier New" w:cs="Courier New"/>
-          <w:kern w:val="0"/>
-          <w:sz w:val="20"/>
-          <w:szCs w:val="20"/>
-          <w14:ligatures w14:val="none"/>
-        </w:rPr>
-        <w:t>null  int</w:t>
-      </w:r>
-      <w:proofErr w:type="gramEnd"/>
-      <w:r>
-        <w:rPr>
-          <w:rFonts w:ascii="Courier New" w:eastAsia="Times New Roman" w:hAnsi="Courier New" w:cs="Courier New"/>
-          <w:kern w:val="0"/>
-          <w:sz w:val="20"/>
-          <w:szCs w:val="20"/>
-          <w14:ligatures w14:val="none"/>
-        </w:rPr>
-        <w:t>64</w:t>
+        <w:t xml:space="preserve"> 23  default    30000 non-null  int64</w:t>
       </w:r>
     </w:p>
     <w:p>
@@ -14301,29 +13507,7 @@
           <w:szCs w:val="20"/>
           <w14:ligatures w14:val="none"/>
         </w:rPr>
-        <w:t xml:space="preserve">Class imbalance ratio: 3.5:1 (no </w:t>
-      </w:r>
-      <w:proofErr w:type="gramStart"/>
-      <w:r>
-        <w:rPr>
-          <w:rFonts w:ascii="Courier New" w:eastAsia="Times New Roman" w:hAnsi="Courier New" w:cs="Courier New"/>
-          <w:kern w:val="0"/>
-          <w:sz w:val="20"/>
-          <w:szCs w:val="20"/>
-          <w14:ligatures w14:val="none"/>
-        </w:rPr>
-        <w:t>default :</w:t>
-      </w:r>
-      <w:proofErr w:type="gramEnd"/>
-      <w:r>
-        <w:rPr>
-          <w:rFonts w:ascii="Courier New" w:eastAsia="Times New Roman" w:hAnsi="Courier New" w:cs="Courier New"/>
-          <w:kern w:val="0"/>
-          <w:sz w:val="20"/>
-          <w:szCs w:val="20"/>
-          <w14:ligatures w14:val="none"/>
-        </w:rPr>
-        <w:t xml:space="preserve"> default)</w:t>
+        <w:t>Class imbalance ratio: 3.5:1 (no default : default)</w:t>
       </w:r>
     </w:p>
     <w:p>
@@ -14531,63 +13715,6 @@
           <w14:ligatures w14:val="none"/>
         </w:rPr>
       </w:pPr>
-      <w:r>
-        <w:rPr>
-          <w:rFonts w:ascii="Times New Roman" w:eastAsia="Times New Roman" w:hAnsi="Times New Roman" w:cs="Times New Roman"/>
-          <w:noProof/>
-          <w:kern w:val="0"/>
-          <w14:ligatures w14:val="none"/>
-        </w:rPr>
-        <w:lastRenderedPageBreak/>
-        <w:drawing>
-          <wp:inline distT="0" distB="0" distL="0" distR="0" wp14:anchorId="36F10C92" wp14:editId="587C129B">
-            <wp:extent cx="12682855" cy="4510405"/>
-            <wp:effectExtent l="0" t="0" r="4445" b="4445"/>
-            <wp:docPr id="43" name="Picture 23"/>
-            <wp:cNvGraphicFramePr>
-              <a:graphicFrameLocks xmlns:a="http://schemas.openxmlformats.org/drawingml/2006/main" noChangeAspect="1"/>
-            </wp:cNvGraphicFramePr>
-            <a:graphic xmlns:a="http://schemas.openxmlformats.org/drawingml/2006/main">
-              <a:graphicData uri="http://schemas.openxmlformats.org/drawingml/2006/picture">
-                <pic:pic xmlns:pic="http://schemas.openxmlformats.org/drawingml/2006/picture">
-                  <pic:nvPicPr>
-                    <pic:cNvPr id="0" name="Picture 43"/>
-                    <pic:cNvPicPr>
-                      <a:picLocks noChangeAspect="1" noChangeArrowheads="1"/>
-                    </pic:cNvPicPr>
-                  </pic:nvPicPr>
-                  <pic:blipFill>
-                    <a:blip r:embed="rId7">
-                      <a:extLst>
-                        <a:ext uri="{28A0092B-C50C-407E-A947-70E740481C1C}">
-                          <a14:useLocalDpi xmlns:a14="http://schemas.microsoft.com/office/drawing/2010/main" val="0"/>
-                        </a:ext>
-                      </a:extLst>
-                    </a:blip>
-                    <a:srcRect/>
-                    <a:stretch>
-                      <a:fillRect/>
-                    </a:stretch>
-                  </pic:blipFill>
-                  <pic:spPr bwMode="auto">
-                    <a:xfrm>
-                      <a:off x="0" y="0"/>
-                      <a:ext cx="12682855" cy="4510405"/>
-                    </a:xfrm>
-                    <a:prstGeom prst="rect">
-                      <a:avLst/>
-                    </a:prstGeom>
-                    <a:noFill/>
-                    <a:ln>
-                      <a:noFill/>
-                    </a:ln>
-                  </pic:spPr>
-                </pic:pic>
-              </a:graphicData>
-            </a:graphic>
-          </wp:inline>
-        </w:drawing>
-      </w:r>
     </w:p>
     <w:p>
       <w:pPr>
@@ -14598,63 +13725,6 @@
           <w14:ligatures w14:val="none"/>
         </w:rPr>
       </w:pPr>
-      <w:r>
-        <w:rPr>
-          <w:rFonts w:ascii="Times New Roman" w:eastAsia="Times New Roman" w:hAnsi="Times New Roman" w:cs="Times New Roman"/>
-          <w:noProof/>
-          <w:kern w:val="0"/>
-          <w14:ligatures w14:val="none"/>
-        </w:rPr>
-        <w:lastRenderedPageBreak/>
-        <w:drawing>
-          <wp:inline distT="0" distB="0" distL="0" distR="0" wp14:anchorId="2AE2AEC9" wp14:editId="55580CC4">
-            <wp:extent cx="13668375" cy="10854055"/>
-            <wp:effectExtent l="0" t="0" r="9525" b="4445"/>
-            <wp:docPr id="44" name="Picture 22"/>
-            <wp:cNvGraphicFramePr>
-              <a:graphicFrameLocks xmlns:a="http://schemas.openxmlformats.org/drawingml/2006/main" noChangeAspect="1"/>
-            </wp:cNvGraphicFramePr>
-            <a:graphic xmlns:a="http://schemas.openxmlformats.org/drawingml/2006/main">
-              <a:graphicData uri="http://schemas.openxmlformats.org/drawingml/2006/picture">
-                <pic:pic xmlns:pic="http://schemas.openxmlformats.org/drawingml/2006/picture">
-                  <pic:nvPicPr>
-                    <pic:cNvPr id="0" name="Picture 44"/>
-                    <pic:cNvPicPr>
-                      <a:picLocks noChangeAspect="1" noChangeArrowheads="1"/>
-                    </pic:cNvPicPr>
-                  </pic:nvPicPr>
-                  <pic:blipFill>
-                    <a:blip r:embed="rId8">
-                      <a:extLst>
-                        <a:ext uri="{28A0092B-C50C-407E-A947-70E740481C1C}">
-                          <a14:useLocalDpi xmlns:a14="http://schemas.microsoft.com/office/drawing/2010/main" val="0"/>
-                        </a:ext>
-                      </a:extLst>
-                    </a:blip>
-                    <a:srcRect/>
-                    <a:stretch>
-                      <a:fillRect/>
-                    </a:stretch>
-                  </pic:blipFill>
-                  <pic:spPr bwMode="auto">
-                    <a:xfrm>
-                      <a:off x="0" y="0"/>
-                      <a:ext cx="13668375" cy="10854055"/>
-                    </a:xfrm>
-                    <a:prstGeom prst="rect">
-                      <a:avLst/>
-                    </a:prstGeom>
-                    <a:noFill/>
-                    <a:ln>
-                      <a:noFill/>
-                    </a:ln>
-                  </pic:spPr>
-                </pic:pic>
-              </a:graphicData>
-            </a:graphic>
-          </wp:inline>
-        </w:drawing>
-      </w:r>
     </w:p>
     <w:p>
       <w:pPr>
@@ -14693,7 +13763,6 @@
           <w:szCs w:val="20"/>
           <w14:ligatures w14:val="none"/>
         </w:rPr>
-        <w:lastRenderedPageBreak/>
         <w:t>=== Top 10 Features Correlated with Default ===</w:t>
       </w:r>
     </w:p>
@@ -15474,29 +14543,7 @@
           <w:szCs w:val="20"/>
           <w14:ligatures w14:val="none"/>
         </w:rPr>
-        <w:t>EDUCATION values (after)</w:t>
-      </w:r>
-      <w:proofErr w:type="gramStart"/>
-      <w:r>
-        <w:rPr>
-          <w:rFonts w:ascii="Courier New" w:eastAsia="Times New Roman" w:hAnsi="Courier New" w:cs="Courier New"/>
-          <w:kern w:val="0"/>
-          <w:sz w:val="20"/>
-          <w:szCs w:val="20"/>
-          <w14:ligatures w14:val="none"/>
-        </w:rPr>
-        <w:t>:  [</w:t>
-      </w:r>
-      <w:proofErr w:type="gramEnd"/>
-      <w:r>
-        <w:rPr>
-          <w:rFonts w:ascii="Courier New" w:eastAsia="Times New Roman" w:hAnsi="Courier New" w:cs="Courier New"/>
-          <w:kern w:val="0"/>
-          <w:sz w:val="20"/>
-          <w:szCs w:val="20"/>
-          <w14:ligatures w14:val="none"/>
-        </w:rPr>
-        <w:t>np.int64(1), np.int64(2), np.int64(3), np.int64(4)]</w:t>
+        <w:t>EDUCATION values (after):  [np.int64(1), np.int64(2), np.int64(3), np.int64(4)]</w:t>
       </w:r>
     </w:p>
     <w:p>
@@ -15646,29 +14693,7 @@
           <w:szCs w:val="20"/>
           <w14:ligatures w14:val="none"/>
         </w:rPr>
-        <w:t>MARRIAGE values (after)</w:t>
-      </w:r>
-      <w:proofErr w:type="gramStart"/>
-      <w:r>
-        <w:rPr>
-          <w:rFonts w:ascii="Courier New" w:eastAsia="Times New Roman" w:hAnsi="Courier New" w:cs="Courier New"/>
-          <w:kern w:val="0"/>
-          <w:sz w:val="20"/>
-          <w:szCs w:val="20"/>
-          <w14:ligatures w14:val="none"/>
-        </w:rPr>
-        <w:t>:  [</w:t>
-      </w:r>
-      <w:proofErr w:type="gramEnd"/>
-      <w:r>
-        <w:rPr>
-          <w:rFonts w:ascii="Courier New" w:eastAsia="Times New Roman" w:hAnsi="Courier New" w:cs="Courier New"/>
-          <w:kern w:val="0"/>
-          <w:sz w:val="20"/>
-          <w:szCs w:val="20"/>
-          <w14:ligatures w14:val="none"/>
-        </w:rPr>
-        <w:t>np.int64(1), np.int64(2), np.int64(3)]</w:t>
+        <w:t>MARRIAGE values (after):  [np.int64(1), np.int64(2), np.int64(3)]</w:t>
       </w:r>
     </w:p>
     <w:p>
@@ -15818,29 +14843,7 @@
           <w:szCs w:val="20"/>
           <w14:ligatures w14:val="none"/>
         </w:rPr>
-        <w:t>Target vector shape</w:t>
-      </w:r>
-      <w:proofErr w:type="gramStart"/>
-      <w:r>
-        <w:rPr>
-          <w:rFonts w:ascii="Courier New" w:eastAsia="Times New Roman" w:hAnsi="Courier New" w:cs="Courier New"/>
-          <w:kern w:val="0"/>
-          <w:sz w:val="20"/>
-          <w:szCs w:val="20"/>
-          <w14:ligatures w14:val="none"/>
-        </w:rPr>
-        <w:t>:  (</w:t>
-      </w:r>
-      <w:proofErr w:type="gramEnd"/>
-      <w:r>
-        <w:rPr>
-          <w:rFonts w:ascii="Courier New" w:eastAsia="Times New Roman" w:hAnsi="Courier New" w:cs="Courier New"/>
-          <w:kern w:val="0"/>
-          <w:sz w:val="20"/>
-          <w:szCs w:val="20"/>
-          <w14:ligatures w14:val="none"/>
-        </w:rPr>
-        <w:t>30000,)</w:t>
+        <w:t>Target vector shape:  (30000,)</w:t>
       </w:r>
     </w:p>
     <w:p>
@@ -16870,7 +15873,6 @@
           <w:szCs w:val="20"/>
           <w14:ligatures w14:val="none"/>
         </w:rPr>
-        <w:lastRenderedPageBreak/>
         <w:t>Train size: 24,000 samples (80%)</w:t>
       </w:r>
     </w:p>
@@ -16903,7 +15905,6 @@
           <w14:ligatures w14:val="none"/>
         </w:rPr>
       </w:pPr>
-      <w:proofErr w:type="gramStart"/>
       <w:r>
         <w:rPr>
           <w:rFonts w:ascii="Courier New" w:eastAsia="Times New Roman" w:hAnsi="Courier New" w:cs="Courier New"/>
@@ -16912,18 +15913,7 @@
           <w:szCs w:val="20"/>
           <w14:ligatures w14:val="none"/>
         </w:rPr>
-        <w:t>Test size:  6,000</w:t>
-      </w:r>
-      <w:proofErr w:type="gramEnd"/>
-      <w:r>
-        <w:rPr>
-          <w:rFonts w:ascii="Courier New" w:eastAsia="Times New Roman" w:hAnsi="Courier New" w:cs="Courier New"/>
-          <w:kern w:val="0"/>
-          <w:sz w:val="20"/>
-          <w:szCs w:val="20"/>
-          <w14:ligatures w14:val="none"/>
-        </w:rPr>
-        <w:t xml:space="preserve"> samples (20%)</w:t>
+        <w:t>Test size:  6,000 samples (20%)</w:t>
       </w:r>
     </w:p>
     <w:p>
@@ -17025,7 +16015,6 @@
           <w14:ligatures w14:val="none"/>
         </w:rPr>
       </w:pPr>
-      <w:proofErr w:type="gramStart"/>
       <w:r>
         <w:rPr>
           <w:rFonts w:ascii="Courier New" w:eastAsia="Times New Roman" w:hAnsi="Courier New" w:cs="Courier New"/>
@@ -17034,18 +16023,7 @@
           <w:szCs w:val="20"/>
           <w14:ligatures w14:val="none"/>
         </w:rPr>
-        <w:t>Test  default</w:t>
-      </w:r>
-      <w:proofErr w:type="gramEnd"/>
-      <w:r>
-        <w:rPr>
-          <w:rFonts w:ascii="Courier New" w:eastAsia="Times New Roman" w:hAnsi="Courier New" w:cs="Courier New"/>
-          <w:kern w:val="0"/>
-          <w:sz w:val="20"/>
-          <w:szCs w:val="20"/>
-          <w14:ligatures w14:val="none"/>
-        </w:rPr>
-        <w:t xml:space="preserve"> rate: 22.12%</w:t>
+        <w:t>Test  default rate: 22.12%</w:t>
       </w:r>
     </w:p>
     <w:p>
@@ -17207,29 +16185,7 @@
           <w:szCs w:val="20"/>
           <w14:ligatures w14:val="none"/>
         </w:rPr>
-        <w:t xml:space="preserve">Train </w:t>
-      </w:r>
-      <w:proofErr w:type="gramStart"/>
-      <w:r>
-        <w:rPr>
-          <w:rFonts w:ascii="Courier New" w:eastAsia="Times New Roman" w:hAnsi="Courier New" w:cs="Courier New"/>
-          <w:kern w:val="0"/>
-          <w:sz w:val="20"/>
-          <w:szCs w:val="20"/>
-          <w14:ligatures w14:val="none"/>
-        </w:rPr>
-        <w:t>mean</w:t>
-      </w:r>
-      <w:proofErr w:type="gramEnd"/>
-      <w:r>
-        <w:rPr>
-          <w:rFonts w:ascii="Courier New" w:eastAsia="Times New Roman" w:hAnsi="Courier New" w:cs="Courier New"/>
-          <w:kern w:val="0"/>
-          <w:sz w:val="20"/>
-          <w:szCs w:val="20"/>
-          <w14:ligatures w14:val="none"/>
-        </w:rPr>
-        <w:t xml:space="preserve"> post-scale: 0.000000 (expected ~0)</w:t>
+        <w:t>Train mean post-scale: 0.000000 (expected ~0)</w:t>
       </w:r>
     </w:p>
     <w:p>
@@ -17269,51 +16225,7 @@
           <w:szCs w:val="20"/>
           <w14:ligatures w14:val="none"/>
         </w:rPr>
-        <w:t xml:space="preserve">Train </w:t>
-      </w:r>
-      <w:proofErr w:type="gramStart"/>
-      <w:r>
-        <w:rPr>
-          <w:rFonts w:ascii="Courier New" w:eastAsia="Times New Roman" w:hAnsi="Courier New" w:cs="Courier New"/>
-          <w:kern w:val="0"/>
-          <w:sz w:val="20"/>
-          <w:szCs w:val="20"/>
-          <w14:ligatures w14:val="none"/>
-        </w:rPr>
-        <w:t>std  post</w:t>
-      </w:r>
-      <w:proofErr w:type="gramEnd"/>
-      <w:r>
-        <w:rPr>
-          <w:rFonts w:ascii="Courier New" w:eastAsia="Times New Roman" w:hAnsi="Courier New" w:cs="Courier New"/>
-          <w:kern w:val="0"/>
-          <w:sz w:val="20"/>
-          <w:szCs w:val="20"/>
-          <w14:ligatures w14:val="none"/>
-        </w:rPr>
-        <w:t xml:space="preserve">-scale: </w:t>
-      </w:r>
-      <w:proofErr w:type="gramStart"/>
-      <w:r>
-        <w:rPr>
-          <w:rFonts w:ascii="Courier New" w:eastAsia="Times New Roman" w:hAnsi="Courier New" w:cs="Courier New"/>
-          <w:kern w:val="0"/>
-          <w:sz w:val="20"/>
-          <w:szCs w:val="20"/>
-          <w14:ligatures w14:val="none"/>
-        </w:rPr>
-        <w:t>1.000000  (</w:t>
-      </w:r>
-      <w:proofErr w:type="gramEnd"/>
-      <w:r>
-        <w:rPr>
-          <w:rFonts w:ascii="Courier New" w:eastAsia="Times New Roman" w:hAnsi="Courier New" w:cs="Courier New"/>
-          <w:kern w:val="0"/>
-          <w:sz w:val="20"/>
-          <w:szCs w:val="20"/>
-          <w14:ligatures w14:val="none"/>
-        </w:rPr>
-        <w:t>expected ~1)</w:t>
+        <w:t>Train std  post-scale: 1.000000  (expected ~1)</w:t>
       </w:r>
     </w:p>
     <w:p>
@@ -17433,20 +16345,8 @@
           <w:szCs w:val="20"/>
           <w14:ligatures w14:val="none"/>
         </w:rPr>
-        <w:t>Components for 90% variance</w:t>
+        <w:t>Components for 90% variance:  13</w:t>
       </w:r>
-      <w:proofErr w:type="gramStart"/>
-      <w:r>
-        <w:rPr>
-          <w:rFonts w:ascii="Courier New" w:eastAsia="Times New Roman" w:hAnsi="Courier New" w:cs="Courier New"/>
-          <w:kern w:val="0"/>
-          <w:sz w:val="20"/>
-          <w:szCs w:val="20"/>
-          <w14:ligatures w14:val="none"/>
-        </w:rPr>
-        <w:t>:  13</w:t>
-      </w:r>
-      <w:proofErr w:type="gramEnd"/>
     </w:p>
     <w:p>
       <w:pPr>
@@ -17485,20 +16385,8 @@
           <w:szCs w:val="20"/>
           <w14:ligatures w14:val="none"/>
         </w:rPr>
-        <w:t>Components for 95% variance</w:t>
+        <w:t>Components for 95% variance:  15</w:t>
       </w:r>
-      <w:proofErr w:type="gramStart"/>
-      <w:r>
-        <w:rPr>
-          <w:rFonts w:ascii="Courier New" w:eastAsia="Times New Roman" w:hAnsi="Courier New" w:cs="Courier New"/>
-          <w:kern w:val="0"/>
-          <w:sz w:val="20"/>
-          <w:szCs w:val="20"/>
-          <w14:ligatures w14:val="none"/>
-        </w:rPr>
-        <w:t>:  15</w:t>
-      </w:r>
-      <w:proofErr w:type="gramEnd"/>
     </w:p>
     <w:p>
       <w:pPr>
@@ -17537,20 +16425,8 @@
           <w:szCs w:val="20"/>
           <w14:ligatures w14:val="none"/>
         </w:rPr>
-        <w:t>Components for 99% variance</w:t>
+        <w:t>Components for 99% variance:  19</w:t>
       </w:r>
-      <w:proofErr w:type="gramStart"/>
-      <w:r>
-        <w:rPr>
-          <w:rFonts w:ascii="Courier New" w:eastAsia="Times New Roman" w:hAnsi="Courier New" w:cs="Courier New"/>
-          <w:kern w:val="0"/>
-          <w:sz w:val="20"/>
-          <w:szCs w:val="20"/>
-          <w14:ligatures w14:val="none"/>
-        </w:rPr>
-        <w:t>:  19</w:t>
-      </w:r>
-      <w:proofErr w:type="gramEnd"/>
     </w:p>
     <w:p>
       <w:pPr>
@@ -17671,62 +16547,6 @@
           <w14:ligatures w14:val="none"/>
         </w:rPr>
       </w:pPr>
-      <w:r>
-        <w:rPr>
-          <w:rFonts w:ascii="Times New Roman" w:eastAsia="Times New Roman" w:hAnsi="Times New Roman" w:cs="Times New Roman"/>
-          <w:noProof/>
-          <w:kern w:val="0"/>
-          <w14:ligatures w14:val="none"/>
-        </w:rPr>
-        <w:drawing>
-          <wp:inline distT="0" distB="0" distL="0" distR="0" wp14:anchorId="2DEE9A70" wp14:editId="35A78F5C">
-            <wp:extent cx="12682855" cy="4510405"/>
-            <wp:effectExtent l="0" t="0" r="4445" b="4445"/>
-            <wp:docPr id="45" name="Picture 21"/>
-            <wp:cNvGraphicFramePr>
-              <a:graphicFrameLocks xmlns:a="http://schemas.openxmlformats.org/drawingml/2006/main" noChangeAspect="1"/>
-            </wp:cNvGraphicFramePr>
-            <a:graphic xmlns:a="http://schemas.openxmlformats.org/drawingml/2006/main">
-              <a:graphicData uri="http://schemas.openxmlformats.org/drawingml/2006/picture">
-                <pic:pic xmlns:pic="http://schemas.openxmlformats.org/drawingml/2006/picture">
-                  <pic:nvPicPr>
-                    <pic:cNvPr id="0" name="Picture 45"/>
-                    <pic:cNvPicPr>
-                      <a:picLocks noChangeAspect="1" noChangeArrowheads="1"/>
-                    </pic:cNvPicPr>
-                  </pic:nvPicPr>
-                  <pic:blipFill>
-                    <a:blip r:embed="rId9">
-                      <a:extLst>
-                        <a:ext uri="{28A0092B-C50C-407E-A947-70E740481C1C}">
-                          <a14:useLocalDpi xmlns:a14="http://schemas.microsoft.com/office/drawing/2010/main" val="0"/>
-                        </a:ext>
-                      </a:extLst>
-                    </a:blip>
-                    <a:srcRect/>
-                    <a:stretch>
-                      <a:fillRect/>
-                    </a:stretch>
-                  </pic:blipFill>
-                  <pic:spPr bwMode="auto">
-                    <a:xfrm>
-                      <a:off x="0" y="0"/>
-                      <a:ext cx="12682855" cy="4510405"/>
-                    </a:xfrm>
-                    <a:prstGeom prst="rect">
-                      <a:avLst/>
-                    </a:prstGeom>
-                    <a:noFill/>
-                    <a:ln>
-                      <a:noFill/>
-                    </a:ln>
-                  </pic:spPr>
-                </pic:pic>
-              </a:graphicData>
-            </a:graphic>
-          </wp:inline>
-        </w:drawing>
-      </w:r>
     </w:p>
     <w:p>
       <w:pPr>
@@ -17737,63 +16557,6 @@
           <w14:ligatures w14:val="none"/>
         </w:rPr>
       </w:pPr>
-      <w:r>
-        <w:rPr>
-          <w:rFonts w:ascii="Times New Roman" w:eastAsia="Times New Roman" w:hAnsi="Times New Roman" w:cs="Times New Roman"/>
-          <w:noProof/>
-          <w:kern w:val="0"/>
-          <w14:ligatures w14:val="none"/>
-        </w:rPr>
-        <w:lastRenderedPageBreak/>
-        <w:drawing>
-          <wp:inline distT="0" distB="0" distL="0" distR="0" wp14:anchorId="783379A3" wp14:editId="69CE4B69">
-            <wp:extent cx="9025255" cy="6272530"/>
-            <wp:effectExtent l="0" t="0" r="4445" b="0"/>
-            <wp:docPr id="46" name="Picture 20"/>
-            <wp:cNvGraphicFramePr>
-              <a:graphicFrameLocks xmlns:a="http://schemas.openxmlformats.org/drawingml/2006/main" noChangeAspect="1"/>
-            </wp:cNvGraphicFramePr>
-            <a:graphic xmlns:a="http://schemas.openxmlformats.org/drawingml/2006/main">
-              <a:graphicData uri="http://schemas.openxmlformats.org/drawingml/2006/picture">
-                <pic:pic xmlns:pic="http://schemas.openxmlformats.org/drawingml/2006/picture">
-                  <pic:nvPicPr>
-                    <pic:cNvPr id="0" name="Picture 46"/>
-                    <pic:cNvPicPr>
-                      <a:picLocks noChangeAspect="1" noChangeArrowheads="1"/>
-                    </pic:cNvPicPr>
-                  </pic:nvPicPr>
-                  <pic:blipFill>
-                    <a:blip r:embed="rId10">
-                      <a:extLst>
-                        <a:ext uri="{28A0092B-C50C-407E-A947-70E740481C1C}">
-                          <a14:useLocalDpi xmlns:a14="http://schemas.microsoft.com/office/drawing/2010/main" val="0"/>
-                        </a:ext>
-                      </a:extLst>
-                    </a:blip>
-                    <a:srcRect/>
-                    <a:stretch>
-                      <a:fillRect/>
-                    </a:stretch>
-                  </pic:blipFill>
-                  <pic:spPr bwMode="auto">
-                    <a:xfrm>
-                      <a:off x="0" y="0"/>
-                      <a:ext cx="9025255" cy="6272530"/>
-                    </a:xfrm>
-                    <a:prstGeom prst="rect">
-                      <a:avLst/>
-                    </a:prstGeom>
-                    <a:noFill/>
-                    <a:ln>
-                      <a:noFill/>
-                    </a:ln>
-                  </pic:spPr>
-                </pic:pic>
-              </a:graphicData>
-            </a:graphic>
-          </wp:inline>
-        </w:drawing>
-      </w:r>
     </w:p>
     <w:p>
       <w:pPr>
@@ -17872,6 +16635,7 @@
           <w:szCs w:val="20"/>
           <w14:ligatures w14:val="none"/>
         </w:rPr>
+        <w:lastRenderedPageBreak/>
         <w:t>suggesting linear separability is limited - non-linear models may perform better.</w:t>
       </w:r>
     </w:p>
@@ -17913,18 +16677,7 @@
           <w:szCs w:val="20"/>
           <w14:ligatures w14:val="none"/>
         </w:rPr>
-        <w:t>evaluate_</w:t>
-      </w:r>
-      <w:proofErr w:type="gramStart"/>
-      <w:r>
-        <w:rPr>
-          <w:rFonts w:ascii="Courier New" w:eastAsia="Times New Roman" w:hAnsi="Courier New" w:cs="Courier New"/>
-          <w:kern w:val="0"/>
-          <w:sz w:val="20"/>
-          <w:szCs w:val="20"/>
-          <w14:ligatures w14:val="none"/>
-        </w:rPr>
-        <w:t>model</w:t>
+        <w:t>evaluate_model</w:t>
       </w:r>
       <w:proofErr w:type="spellEnd"/>
       <w:r>
@@ -17935,18 +16688,7 @@
           <w:szCs w:val="20"/>
           <w14:ligatures w14:val="none"/>
         </w:rPr>
-        <w:t>(</w:t>
-      </w:r>
-      <w:proofErr w:type="gramEnd"/>
-      <w:r>
-        <w:rPr>
-          <w:rFonts w:ascii="Courier New" w:eastAsia="Times New Roman" w:hAnsi="Courier New" w:cs="Courier New"/>
-          <w:kern w:val="0"/>
-          <w:sz w:val="20"/>
-          <w:szCs w:val="20"/>
-          <w14:ligatures w14:val="none"/>
-        </w:rPr>
-        <w:t>) helper defined.</w:t>
+        <w:t>() helper defined.</w:t>
       </w:r>
     </w:p>
     <w:p>
@@ -18136,29 +16878,7 @@
           <w:szCs w:val="20"/>
           <w14:ligatures w14:val="none"/>
         </w:rPr>
-        <w:t xml:space="preserve">              precision    </w:t>
-      </w:r>
-      <w:proofErr w:type="gramStart"/>
-      <w:r>
-        <w:rPr>
-          <w:rFonts w:ascii="Courier New" w:eastAsia="Times New Roman" w:hAnsi="Courier New" w:cs="Courier New"/>
-          <w:kern w:val="0"/>
-          <w:sz w:val="20"/>
-          <w:szCs w:val="20"/>
-          <w14:ligatures w14:val="none"/>
-        </w:rPr>
-        <w:t>recall  f</w:t>
-      </w:r>
-      <w:proofErr w:type="gramEnd"/>
-      <w:r>
-        <w:rPr>
-          <w:rFonts w:ascii="Courier New" w:eastAsia="Times New Roman" w:hAnsi="Courier New" w:cs="Courier New"/>
-          <w:kern w:val="0"/>
-          <w:sz w:val="20"/>
-          <w:szCs w:val="20"/>
-          <w14:ligatures w14:val="none"/>
-        </w:rPr>
-        <w:t>1-score   support</w:t>
+        <w:t xml:space="preserve">              precision    recall  f1-score   support</w:t>
       </w:r>
     </w:p>
     <w:p>
@@ -18338,7 +17058,6 @@
           <w:szCs w:val="20"/>
           <w14:ligatures w14:val="none"/>
         </w:rPr>
-        <w:lastRenderedPageBreak/>
         <w:t xml:space="preserve">    accuracy                           0.68      6000</w:t>
       </w:r>
     </w:p>
@@ -18411,7 +17130,6 @@
           <w14:ligatures w14:val="none"/>
         </w:rPr>
       </w:pPr>
-      <w:proofErr w:type="gramStart"/>
       <w:r>
         <w:rPr>
           <w:rFonts w:ascii="Courier New" w:eastAsia="Times New Roman" w:hAnsi="Courier New" w:cs="Courier New"/>
@@ -18420,18 +17138,7 @@
           <w:szCs w:val="20"/>
           <w14:ligatures w14:val="none"/>
         </w:rPr>
-        <w:t>weighted</w:t>
-      </w:r>
-      <w:proofErr w:type="gramEnd"/>
-      <w:r>
-        <w:rPr>
-          <w:rFonts w:ascii="Courier New" w:eastAsia="Times New Roman" w:hAnsi="Courier New" w:cs="Courier New"/>
-          <w:kern w:val="0"/>
-          <w:sz w:val="20"/>
-          <w:szCs w:val="20"/>
-          <w14:ligatures w14:val="none"/>
-        </w:rPr>
-        <w:t xml:space="preserve"> avg       0.76      0.68      0.70      6000</w:t>
+        <w:t>weighted avg       0.76      0.68      0.70      6000</w:t>
       </w:r>
     </w:p>
     <w:p>
@@ -18498,7 +17205,7 @@
                     </pic:cNvPicPr>
                   </pic:nvPicPr>
                   <pic:blipFill>
-                    <a:blip r:embed="rId11">
+                    <a:blip r:embed="rId7">
                       <a:extLst>
                         <a:ext uri="{28A0092B-C50C-407E-A947-70E740481C1C}">
                           <a14:useLocalDpi xmlns:a14="http://schemas.microsoft.com/office/drawing/2010/main" val="0"/>
@@ -18757,29 +17464,7 @@
           <w:szCs w:val="20"/>
           <w14:ligatures w14:val="none"/>
         </w:rPr>
-        <w:t xml:space="preserve">              precision    </w:t>
-      </w:r>
-      <w:proofErr w:type="gramStart"/>
-      <w:r>
-        <w:rPr>
-          <w:rFonts w:ascii="Courier New" w:eastAsia="Times New Roman" w:hAnsi="Courier New" w:cs="Courier New"/>
-          <w:kern w:val="0"/>
-          <w:sz w:val="20"/>
-          <w:szCs w:val="20"/>
-          <w14:ligatures w14:val="none"/>
-        </w:rPr>
-        <w:t>recall  f</w:t>
-      </w:r>
-      <w:proofErr w:type="gramEnd"/>
-      <w:r>
-        <w:rPr>
-          <w:rFonts w:ascii="Courier New" w:eastAsia="Times New Roman" w:hAnsi="Courier New" w:cs="Courier New"/>
-          <w:kern w:val="0"/>
-          <w:sz w:val="20"/>
-          <w:szCs w:val="20"/>
-          <w14:ligatures w14:val="none"/>
-        </w:rPr>
-        <w:t>1-score   support</w:t>
+        <w:t xml:space="preserve">              precision    recall  f1-score   support</w:t>
       </w:r>
     </w:p>
     <w:p>
@@ -18959,6 +17644,7 @@
           <w:szCs w:val="20"/>
           <w14:ligatures w14:val="none"/>
         </w:rPr>
+        <w:lastRenderedPageBreak/>
         <w:t xml:space="preserve">    accuracy                           0.75      6000</w:t>
       </w:r>
     </w:p>
@@ -19031,7 +17717,6 @@
           <w14:ligatures w14:val="none"/>
         </w:rPr>
       </w:pPr>
-      <w:proofErr w:type="gramStart"/>
       <w:r>
         <w:rPr>
           <w:rFonts w:ascii="Courier New" w:eastAsia="Times New Roman" w:hAnsi="Courier New" w:cs="Courier New"/>
@@ -19040,18 +17725,7 @@
           <w:szCs w:val="20"/>
           <w14:ligatures w14:val="none"/>
         </w:rPr>
-        <w:t>weighted</w:t>
-      </w:r>
-      <w:proofErr w:type="gramEnd"/>
-      <w:r>
-        <w:rPr>
-          <w:rFonts w:ascii="Courier New" w:eastAsia="Times New Roman" w:hAnsi="Courier New" w:cs="Courier New"/>
-          <w:kern w:val="0"/>
-          <w:sz w:val="20"/>
-          <w:szCs w:val="20"/>
-          <w14:ligatures w14:val="none"/>
-        </w:rPr>
-        <w:t xml:space="preserve"> avg       0.77      0.75      0.76      6000</w:t>
+        <w:t>weighted avg       0.77      0.75      0.76      6000</w:t>
       </w:r>
     </w:p>
     <w:p>
@@ -19100,7 +17774,6 @@
           <w:kern w:val="0"/>
           <w14:ligatures w14:val="none"/>
         </w:rPr>
-        <w:lastRenderedPageBreak/>
         <w:drawing>
           <wp:inline distT="0" distB="0" distL="0" distR="0" wp14:anchorId="51C59171" wp14:editId="23696EC6">
             <wp:extent cx="4853305" cy="4453255"/>
@@ -19119,7 +17792,7 @@
                     </pic:cNvPicPr>
                   </pic:nvPicPr>
                   <pic:blipFill>
-                    <a:blip r:embed="rId12">
+                    <a:blip r:embed="rId8">
                       <a:extLst>
                         <a:ext uri="{28A0092B-C50C-407E-A947-70E740481C1C}">
                           <a14:useLocalDpi xmlns:a14="http://schemas.microsoft.com/office/drawing/2010/main" val="0"/>
@@ -19378,29 +18051,7 @@
           <w:szCs w:val="20"/>
           <w14:ligatures w14:val="none"/>
         </w:rPr>
-        <w:t xml:space="preserve">              precision    </w:t>
-      </w:r>
-      <w:proofErr w:type="gramStart"/>
-      <w:r>
-        <w:rPr>
-          <w:rFonts w:ascii="Courier New" w:eastAsia="Times New Roman" w:hAnsi="Courier New" w:cs="Courier New"/>
-          <w:kern w:val="0"/>
-          <w:sz w:val="20"/>
-          <w:szCs w:val="20"/>
-          <w14:ligatures w14:val="none"/>
-        </w:rPr>
-        <w:t>recall  f</w:t>
-      </w:r>
-      <w:proofErr w:type="gramEnd"/>
-      <w:r>
-        <w:rPr>
-          <w:rFonts w:ascii="Courier New" w:eastAsia="Times New Roman" w:hAnsi="Courier New" w:cs="Courier New"/>
-          <w:kern w:val="0"/>
-          <w:sz w:val="20"/>
-          <w:szCs w:val="20"/>
-          <w14:ligatures w14:val="none"/>
-        </w:rPr>
-        <w:t>1-score   support</w:t>
+        <w:t xml:space="preserve">              precision    recall  f1-score   support</w:t>
       </w:r>
     </w:p>
     <w:p>
@@ -19652,7 +18303,6 @@
           <w14:ligatures w14:val="none"/>
         </w:rPr>
       </w:pPr>
-      <w:proofErr w:type="gramStart"/>
       <w:r>
         <w:rPr>
           <w:rFonts w:ascii="Courier New" w:eastAsia="Times New Roman" w:hAnsi="Courier New" w:cs="Courier New"/>
@@ -19661,18 +18311,7 @@
           <w:szCs w:val="20"/>
           <w14:ligatures w14:val="none"/>
         </w:rPr>
-        <w:t xml:space="preserve">weighted avg      </w:t>
-      </w:r>
-      <w:proofErr w:type="gramEnd"/>
-      <w:r>
-        <w:rPr>
-          <w:rFonts w:ascii="Courier New" w:eastAsia="Times New Roman" w:hAnsi="Courier New" w:cs="Courier New"/>
-          <w:kern w:val="0"/>
-          <w:sz w:val="20"/>
-          <w:szCs w:val="20"/>
-          <w14:ligatures w14:val="none"/>
-        </w:rPr>
-        <w:t xml:space="preserve"> 0.78      0.77      0.78      6000</w:t>
+        <w:t>weighted avg       0.78      0.77      0.78      6000</w:t>
       </w:r>
     </w:p>
     <w:p>
@@ -19740,7 +18379,7 @@
                     </pic:cNvPicPr>
                   </pic:nvPicPr>
                   <pic:blipFill>
-                    <a:blip r:embed="rId13">
+                    <a:blip r:embed="rId9">
                       <a:extLst>
                         <a:ext uri="{28A0092B-C50C-407E-A947-70E740481C1C}">
                           <a14:useLocalDpi xmlns:a14="http://schemas.microsoft.com/office/drawing/2010/main" val="0"/>
@@ -19821,63 +18460,6 @@
           <w14:ligatures w14:val="none"/>
         </w:rPr>
       </w:pPr>
-      <w:r>
-        <w:rPr>
-          <w:rFonts w:ascii="Times New Roman" w:eastAsia="Times New Roman" w:hAnsi="Times New Roman" w:cs="Times New Roman"/>
-          <w:noProof/>
-          <w:kern w:val="0"/>
-          <w14:ligatures w14:val="none"/>
-        </w:rPr>
-        <w:lastRenderedPageBreak/>
-        <w:drawing>
-          <wp:inline distT="0" distB="0" distL="0" distR="0" wp14:anchorId="0CF0E5CB" wp14:editId="10AC5DDD">
-            <wp:extent cx="19998055" cy="7196455"/>
-            <wp:effectExtent l="0" t="0" r="4445" b="4445"/>
-            <wp:docPr id="50" name="Picture 16"/>
-            <wp:cNvGraphicFramePr>
-              <a:graphicFrameLocks xmlns:a="http://schemas.openxmlformats.org/drawingml/2006/main" noChangeAspect="1"/>
-            </wp:cNvGraphicFramePr>
-            <a:graphic xmlns:a="http://schemas.openxmlformats.org/drawingml/2006/main">
-              <a:graphicData uri="http://schemas.openxmlformats.org/drawingml/2006/picture">
-                <pic:pic xmlns:pic="http://schemas.openxmlformats.org/drawingml/2006/picture">
-                  <pic:nvPicPr>
-                    <pic:cNvPr id="0" name="Picture 50"/>
-                    <pic:cNvPicPr>
-                      <a:picLocks noChangeAspect="1" noChangeArrowheads="1"/>
-                    </pic:cNvPicPr>
-                  </pic:nvPicPr>
-                  <pic:blipFill>
-                    <a:blip r:embed="rId14">
-                      <a:extLst>
-                        <a:ext uri="{28A0092B-C50C-407E-A947-70E740481C1C}">
-                          <a14:useLocalDpi xmlns:a14="http://schemas.microsoft.com/office/drawing/2010/main" val="0"/>
-                        </a:ext>
-                      </a:extLst>
-                    </a:blip>
-                    <a:srcRect/>
-                    <a:stretch>
-                      <a:fillRect/>
-                    </a:stretch>
-                  </pic:blipFill>
-                  <pic:spPr bwMode="auto">
-                    <a:xfrm>
-                      <a:off x="0" y="0"/>
-                      <a:ext cx="19998055" cy="7196455"/>
-                    </a:xfrm>
-                    <a:prstGeom prst="rect">
-                      <a:avLst/>
-                    </a:prstGeom>
-                    <a:noFill/>
-                    <a:ln>
-                      <a:noFill/>
-                    </a:ln>
-                  </pic:spPr>
-                </pic:pic>
-              </a:graphicData>
-            </a:graphic>
-          </wp:inline>
-        </w:drawing>
-      </w:r>
     </w:p>
     <w:p>
       <w:pPr>
@@ -21298,29 +19880,7 @@
           <w:szCs w:val="20"/>
           <w14:ligatures w14:val="none"/>
         </w:rPr>
-        <w:t>Best F1-</w:t>
-      </w:r>
-      <w:proofErr w:type="gramStart"/>
-      <w:r>
-        <w:rPr>
-          <w:rFonts w:ascii="Courier New" w:eastAsia="Times New Roman" w:hAnsi="Courier New" w:cs="Courier New"/>
-          <w:kern w:val="0"/>
-          <w:sz w:val="20"/>
-          <w:szCs w:val="20"/>
-          <w14:ligatures w14:val="none"/>
-        </w:rPr>
-        <w:t>Score :</w:t>
-      </w:r>
-      <w:proofErr w:type="gramEnd"/>
-      <w:r>
-        <w:rPr>
-          <w:rFonts w:ascii="Courier New" w:eastAsia="Times New Roman" w:hAnsi="Courier New" w:cs="Courier New"/>
-          <w:kern w:val="0"/>
-          <w:sz w:val="20"/>
-          <w:szCs w:val="20"/>
-          <w14:ligatures w14:val="none"/>
-        </w:rPr>
-        <w:t xml:space="preserve"> Decision Tree (0.5173)</w:t>
+        <w:t>Best F1-Score : Decision Tree (0.5173)</w:t>
       </w:r>
     </w:p>
     <w:p>
@@ -21360,29 +19920,7 @@
           <w:szCs w:val="20"/>
           <w14:ligatures w14:val="none"/>
         </w:rPr>
-        <w:t>Best ROC-</w:t>
-      </w:r>
-      <w:proofErr w:type="gramStart"/>
-      <w:r>
-        <w:rPr>
-          <w:rFonts w:ascii="Courier New" w:eastAsia="Times New Roman" w:hAnsi="Courier New" w:cs="Courier New"/>
-          <w:kern w:val="0"/>
-          <w:sz w:val="20"/>
-          <w:szCs w:val="20"/>
-          <w14:ligatures w14:val="none"/>
-        </w:rPr>
-        <w:t>AUC  :</w:t>
-      </w:r>
-      <w:proofErr w:type="gramEnd"/>
-      <w:r>
-        <w:rPr>
-          <w:rFonts w:ascii="Courier New" w:eastAsia="Times New Roman" w:hAnsi="Courier New" w:cs="Courier New"/>
-          <w:kern w:val="0"/>
-          <w:sz w:val="20"/>
-          <w:szCs w:val="20"/>
-          <w14:ligatures w14:val="none"/>
-        </w:rPr>
-        <w:t xml:space="preserve"> Decision Tree (0.7589)</w:t>
+        <w:t>Best ROC-AUC  : Decision Tree (0.7589)</w:t>
       </w:r>
     </w:p>
     <w:p>
@@ -21394,62 +19932,6 @@
           <w14:ligatures w14:val="none"/>
         </w:rPr>
       </w:pPr>
-      <w:r>
-        <w:rPr>
-          <w:rFonts w:ascii="Times New Roman" w:eastAsia="Times New Roman" w:hAnsi="Times New Roman" w:cs="Times New Roman"/>
-          <w:noProof/>
-          <w:kern w:val="0"/>
-          <w14:ligatures w14:val="none"/>
-        </w:rPr>
-        <w:drawing>
-          <wp:inline distT="0" distB="0" distL="0" distR="0" wp14:anchorId="3F9994D8" wp14:editId="01EFE6BC">
-            <wp:extent cx="14511655" cy="5405755"/>
-            <wp:effectExtent l="0" t="0" r="4445" b="4445"/>
-            <wp:docPr id="51" name="Picture 15"/>
-            <wp:cNvGraphicFramePr>
-              <a:graphicFrameLocks xmlns:a="http://schemas.openxmlformats.org/drawingml/2006/main" noChangeAspect="1"/>
-            </wp:cNvGraphicFramePr>
-            <a:graphic xmlns:a="http://schemas.openxmlformats.org/drawingml/2006/main">
-              <a:graphicData uri="http://schemas.openxmlformats.org/drawingml/2006/picture">
-                <pic:pic xmlns:pic="http://schemas.openxmlformats.org/drawingml/2006/picture">
-                  <pic:nvPicPr>
-                    <pic:cNvPr id="0" name="Picture 51"/>
-                    <pic:cNvPicPr>
-                      <a:picLocks noChangeAspect="1" noChangeArrowheads="1"/>
-                    </pic:cNvPicPr>
-                  </pic:nvPicPr>
-                  <pic:blipFill>
-                    <a:blip r:embed="rId15">
-                      <a:extLst>
-                        <a:ext uri="{28A0092B-C50C-407E-A947-70E740481C1C}">
-                          <a14:useLocalDpi xmlns:a14="http://schemas.microsoft.com/office/drawing/2010/main" val="0"/>
-                        </a:ext>
-                      </a:extLst>
-                    </a:blip>
-                    <a:srcRect/>
-                    <a:stretch>
-                      <a:fillRect/>
-                    </a:stretch>
-                  </pic:blipFill>
-                  <pic:spPr bwMode="auto">
-                    <a:xfrm>
-                      <a:off x="0" y="0"/>
-                      <a:ext cx="14511655" cy="5405755"/>
-                    </a:xfrm>
-                    <a:prstGeom prst="rect">
-                      <a:avLst/>
-                    </a:prstGeom>
-                    <a:noFill/>
-                    <a:ln>
-                      <a:noFill/>
-                    </a:ln>
-                  </pic:spPr>
-                </pic:pic>
-              </a:graphicData>
-            </a:graphic>
-          </wp:inline>
-        </w:drawing>
-      </w:r>
     </w:p>
     <w:p>
       <w:pPr>
@@ -21460,63 +19942,6 @@
           <w14:ligatures w14:val="none"/>
         </w:rPr>
       </w:pPr>
-      <w:r>
-        <w:rPr>
-          <w:rFonts w:ascii="Times New Roman" w:eastAsia="Times New Roman" w:hAnsi="Times New Roman" w:cs="Times New Roman"/>
-          <w:noProof/>
-          <w:kern w:val="0"/>
-          <w14:ligatures w14:val="none"/>
-        </w:rPr>
-        <w:lastRenderedPageBreak/>
-        <w:drawing>
-          <wp:inline distT="0" distB="0" distL="0" distR="0" wp14:anchorId="6B73599D" wp14:editId="4341D965">
-            <wp:extent cx="14511655" cy="5405755"/>
-            <wp:effectExtent l="0" t="0" r="4445" b="4445"/>
-            <wp:docPr id="52" name="Picture 14"/>
-            <wp:cNvGraphicFramePr>
-              <a:graphicFrameLocks xmlns:a="http://schemas.openxmlformats.org/drawingml/2006/main" noChangeAspect="1"/>
-            </wp:cNvGraphicFramePr>
-            <a:graphic xmlns:a="http://schemas.openxmlformats.org/drawingml/2006/main">
-              <a:graphicData uri="http://schemas.openxmlformats.org/drawingml/2006/picture">
-                <pic:pic xmlns:pic="http://schemas.openxmlformats.org/drawingml/2006/picture">
-                  <pic:nvPicPr>
-                    <pic:cNvPr id="0" name="Picture 52"/>
-                    <pic:cNvPicPr>
-                      <a:picLocks noChangeAspect="1" noChangeArrowheads="1"/>
-                    </pic:cNvPicPr>
-                  </pic:nvPicPr>
-                  <pic:blipFill>
-                    <a:blip r:embed="rId16">
-                      <a:extLst>
-                        <a:ext uri="{28A0092B-C50C-407E-A947-70E740481C1C}">
-                          <a14:useLocalDpi xmlns:a14="http://schemas.microsoft.com/office/drawing/2010/main" val="0"/>
-                        </a:ext>
-                      </a:extLst>
-                    </a:blip>
-                    <a:srcRect/>
-                    <a:stretch>
-                      <a:fillRect/>
-                    </a:stretch>
-                  </pic:blipFill>
-                  <pic:spPr bwMode="auto">
-                    <a:xfrm>
-                      <a:off x="0" y="0"/>
-                      <a:ext cx="14511655" cy="5405755"/>
-                    </a:xfrm>
-                    <a:prstGeom prst="rect">
-                      <a:avLst/>
-                    </a:prstGeom>
-                    <a:noFill/>
-                    <a:ln>
-                      <a:noFill/>
-                    </a:ln>
-                  </pic:spPr>
-                </pic:pic>
-              </a:graphicData>
-            </a:graphic>
-          </wp:inline>
-        </w:drawing>
-      </w:r>
     </w:p>
     <w:p>
       <w:pPr>
@@ -21755,6 +20180,7 @@
           <w:szCs w:val="20"/>
           <w14:ligatures w14:val="none"/>
         </w:rPr>
+        <w:lastRenderedPageBreak/>
         <w:t>PAY_3        0.0225</w:t>
       </w:r>
     </w:p>
@@ -22305,7 +20731,6 @@
           <w:szCs w:val="20"/>
           <w14:ligatures w14:val="none"/>
         </w:rPr>
-        <w:lastRenderedPageBreak/>
         <w:t>PAY_3        0.0909</w:t>
       </w:r>
     </w:p>

</xml_diff>